<commit_message>
add extra new lines between h2
</commit_message>
<xml_diff>
--- a/Main_Resume.docx
+++ b/Main_Resume.docx
@@ -85,6 +85,14 @@
         </w:r>
       </w:hyperlink>
     </w:p>
+    <w:p>
+      <w:pPr>
+        <w:pStyle w:val="BodyText"/>
+      </w:pPr>
+      <w:r>
+        <w:t xml:space="preserve"> </w:t>
+      </w:r>
+    </w:p>
     <w:bookmarkStart w:id="28" w:name="skills"/>
     <w:p>
       <w:pPr>
@@ -164,6 +172,14 @@
       </w:r>
       <w:r>
         <w:t xml:space="preserve">Docker, Linux/WSL, Git, pytest, Vitest, Playwright, Vercel, Railway, Render, Heroku, Supabase.</w:t>
+      </w:r>
+    </w:p>
+    <w:p>
+      <w:pPr>
+        <w:pStyle w:val="BodyText"/>
+      </w:pPr>
+      <w:r>
+        <w:t xml:space="preserve"> </w:t>
       </w:r>
     </w:p>
     <w:bookmarkEnd w:id="28"/>
@@ -436,6 +452,14 @@
         <w:t xml:space="preserve">Gained cleanroom process experience (lithography, etching, CVD) at ASU NanoFab and MacroTechnology Works; performed die wire-bond testing on the Sigma Bond Tester.</w:t>
       </w:r>
     </w:p>
+    <w:p>
+      <w:pPr>
+        <w:pStyle w:val="FirstParagraph"/>
+      </w:pPr>
+      <w:r>
+        <w:t xml:space="preserve"> </w:t>
+      </w:r>
+    </w:p>
     <w:bookmarkEnd w:id="35"/>
     <w:bookmarkEnd w:id="36"/>
     <w:bookmarkEnd w:id="37"/>
@@ -654,6 +678,14 @@
       </w:pPr>
       <w:r>
         <w:t xml:space="preserve">Built a two-stage grid-connected PV simulation in MATLAB/Simulink modeling dual DC/DC boost converters with Hill-Climbing MPPT, PID-controlled DC link, and AC grid injection stage.</w:t>
+      </w:r>
+    </w:p>
+    <w:p>
+      <w:pPr>
+        <w:pStyle w:val="FirstParagraph"/>
+      </w:pPr>
+      <w:r>
+        <w:t xml:space="preserve"> </w:t>
       </w:r>
     </w:p>
     <w:bookmarkEnd w:id="44"/>

</xml_diff>

<commit_message>
add summary to resume
</commit_message>
<xml_diff>
--- a/Main_Resume.docx
+++ b/Main_Resume.docx
@@ -84,6 +84,22 @@
           <w:t xml:space="preserve">https://laplacient.com</w:t>
         </w:r>
       </w:hyperlink>
+    </w:p>
+    <w:p>
+      <w:pPr>
+        <w:pStyle w:val="BodyText"/>
+      </w:pPr>
+      <w:r>
+        <w:t xml:space="preserve"> </w:t>
+      </w:r>
+    </w:p>
+    <w:p>
+      <w:pPr>
+        <w:pStyle w:val="BodyText"/>
+      </w:pPr>
+      <w:r>
+        <w:t xml:space="preserve">Software engineer and AI/ML researcher with experience evaluating frontier LLMs, building production software and agentic automation systems, and developing machine-learning models for engineering applications. Background spans LLM evaluation, full-stack development, ML infrastructure, and electrical engineering, with experience delivering software across research, startup, and client environments.</w:t>
+      </w:r>
     </w:p>
     <w:p>
       <w:pPr>

</xml_diff>